<commit_message>
Fix Word report encoding
</commit_message>
<xml_diff>
--- a/Java_Буньо_Проєкт_RenovaCalc.docx
+++ b/Java_Буньо_Проєкт_RenovaCalc.docx
@@ -15,7 +15,7 @@
           <w:b/>
           <w:bCs/>
         </w:rPr>
-        <w:t xml:space="preserve">???? ??? ????????? ???????</w:t>
+        <w:t xml:space="preserve">Звіт про виконання проєкту</w:t>
       </w:r>
     </w:p>
     <w:p>
@@ -29,7 +29,7 @@
           <w:sz w:val="28"/>
           <w:szCs w:val="28"/>
         </w:rPr>
-        <w:t xml:space="preserve">? ?????????? ????????????? ????? Java</w:t>
+        <w:t xml:space="preserve">З дисципліни Програмування мовою Java</w:t>
       </w:r>
     </w:p>
     <w:p>
@@ -43,7 +43,7 @@
           <w:sz w:val="28"/>
           <w:szCs w:val="28"/>
         </w:rPr>
-        <w:t xml:space="preserve">?? ????</w:t>
+        <w:t xml:space="preserve">на тему</w:t>
       </w:r>
     </w:p>
     <w:p>
@@ -59,7 +59,7 @@
           <w:b/>
           <w:bCs/>
         </w:rPr>
-        <w:t xml:space="preserve">?RenovaCalc: ??????????? ???????? ??????? ? ????????? ??????????? ????????????</w:t>
+        <w:t xml:space="preserve">«RenovaCalc: калькулятор вартості ремонту з графічним інтерфейсом користувача»</w:t>
       </w:r>
     </w:p>
     <w:p>
@@ -73,7 +73,7 @@
           <w:sz w:val="28"/>
           <w:szCs w:val="28"/>
         </w:rPr>
-        <w:t xml:space="preserve">???????? ????? ??-2226?</w:t>
+        <w:t xml:space="preserve">студента групи ІН-2226Б</w:t>
       </w:r>
     </w:p>
     <w:p>
@@ -87,7 +87,7 @@
           <w:sz w:val="28"/>
           <w:szCs w:val="28"/>
         </w:rPr>
-        <w:t xml:space="preserve">????? ??????</w:t>
+        <w:t xml:space="preserve">Буньо Андрія</w:t>
       </w:r>
     </w:p>
     <w:p>
@@ -108,6 +108,11 @@
       <w:r>
         <w:br w:type="page"/>
       </w:r>
+    </w:p>
+    <w:p>
+      <w:pPr>
+        <w:spacing w:after="60" w:line="360" w:lineRule="auto"/>
+      </w:pPr>
     </w:p>
     <w:p>
       <w:pPr>
@@ -121,8 +126,13 @@
           <w:b/>
           <w:bCs/>
         </w:rPr>
-        <w:t xml:space="preserve">?????????? ????????</w:t>
-      </w:r>
+        <w:t xml:space="preserve">Постановка завдання</w:t>
+      </w:r>
+    </w:p>
+    <w:p>
+      <w:pPr>
+        <w:spacing w:after="60" w:line="360" w:lineRule="auto"/>
+      </w:pPr>
     </w:p>
     <w:p>
       <w:pPr>
@@ -135,22 +145,13 @@
           <w:sz w:val="28"/>
           <w:szCs w:val="28"/>
         </w:rPr>
-        <w:t xml:space="preserve">????????? ?????????? ?????????? ?????????? ????? Java ? ????????? ??????????? ???????????. ?????? ??????? ???? ??????? ???????????, ????????????? ??????? ?????? ? ????????? GUI-???????????? ?? ??????? ?? ????? ????? ????? ???????????.</w:t>
-      </w:r>
-    </w:p>
-    <w:p>
-      <w:pPr>
-        <w:ind w:firstLine="708"/>
-        <w:spacing w:after="120" w:line="360" w:lineRule="auto"/>
-      </w:pPr>
-      <w:r>
-        <w:rPr>
-          <w:rFonts w:ascii="Times New Roman" w:hAnsi="Times New Roman" w:cs="Times New Roman"/>
-          <w:sz w:val="28"/>
-          <w:szCs w:val="28"/>
-        </w:rPr>
-        <w:t xml:space="preserve">????????? ?????? ???????? ???????? ? ??????? ???????, ??????????? ?? GitHub ?? ??????????? ???? ?? ??????????? ????????, ???????????? ????????, ???????? ???????????, ???????????, ?????? ???????????? ??????????? ? ?????????? ?? ???????????.</w:t>
-      </w:r>
+        <w:t xml:space="preserve">Розробити завершений Java-застосунок з графічним інтерфейсом користувача, який має практичне призначення, демонструє роботу з основними GUI-компонентами та може бути розміщений у GitHub-репозиторії разом зі звітом і скриншотами.</w:t>
+      </w:r>
+    </w:p>
+    <w:p>
+      <w:pPr>
+        <w:spacing w:after="60" w:line="360" w:lineRule="auto"/>
+      </w:pPr>
     </w:p>
     <w:p>
       <w:pPr>
@@ -164,8 +165,13 @@
           <w:b/>
           <w:bCs/>
         </w:rPr>
-        <w:t xml:space="preserve">??????????? ???????</w:t>
-      </w:r>
+        <w:t xml:space="preserve">Призначення проєкту</w:t>
+      </w:r>
+    </w:p>
+    <w:p>
+      <w:pPr>
+        <w:spacing w:after="60" w:line="360" w:lineRule="auto"/>
+      </w:pPr>
     </w:p>
     <w:p>
       <w:pPr>
@@ -178,22 +184,13 @@
           <w:sz w:val="28"/>
           <w:szCs w:val="28"/>
         </w:rPr>
-        <w:t xml:space="preserve">?????? RenovaCalc ? ?????????? Java Swing ??????????? ??? ???????????? ?????????? ???????? ???????. ?????????? ??????? ????????? ???????, ?????, ????????? ??????, ?????, ??????, ?????? ?????? ?? ??????? ???????? ???? ?????.</w:t>
-      </w:r>
-    </w:p>
-    <w:p>
-      <w:pPr>
-        <w:ind w:firstLine="708"/>
-        <w:spacing w:after="120" w:line="360" w:lineRule="auto"/>
-      </w:pPr>
-      <w:r>
-        <w:rPr>
-          <w:rFonts w:ascii="Times New Roman" w:hAnsi="Times New Roman" w:cs="Times New Roman"/>
-          <w:sz w:val="28"/>
-          <w:szCs w:val="28"/>
-        </w:rPr>
-        <w:t xml:space="preserve">????? ?????????? ???????? ?????? ????????????? ????????, ??????? ???????? ????, ????????? ??????????? ?? ????????? ???????????? ???????. ????? ??????????? ??????? ?????????? ? ????????? ????.</w:t>
-      </w:r>
+        <w:t xml:space="preserve">Проєкт RenovaCalc - це калькулятор орієнтовної вартості ремонту. Користувач вводить площу, кількість кімнат, місто, бюджет, рівень якості, складність і набір робіт. Програма формує деталізований кошторис, показує суму робіт, додаткові нарахування, загальну вартість та індикатор використання бюджету.</w:t>
+      </w:r>
+    </w:p>
+    <w:p>
+      <w:pPr>
+        <w:spacing w:after="60" w:line="360" w:lineRule="auto"/>
+      </w:pPr>
     </w:p>
     <w:p>
       <w:pPr>
@@ -207,73 +204,70 @@
           <w:b/>
           <w:bCs/>
         </w:rPr>
-        <w:t xml:space="preserve">?????? ???????????</w:t>
-      </w:r>
-    </w:p>
-    <w:p>
-      <w:pPr>
-        <w:spacing w:after="80" w:line="360" w:lineRule="auto"/>
-      </w:pPr>
-      <w:r>
-        <w:rPr>
-          <w:rFonts w:ascii="Times New Roman" w:hAnsi="Times New Roman" w:cs="Times New Roman"/>
-          <w:sz w:val="28"/>
-          <w:szCs w:val="28"/>
-        </w:rPr>
-        <w:t xml:space="preserve">- ???? ?????????????: Java 21;</w:t>
-      </w:r>
-    </w:p>
-    <w:p>
-      <w:pPr>
-        <w:spacing w:after="80" w:line="360" w:lineRule="auto"/>
-      </w:pPr>
-      <w:r>
-        <w:rPr>
-          <w:rFonts w:ascii="Times New Roman" w:hAnsi="Times New Roman" w:cs="Times New Roman"/>
-          <w:sz w:val="28"/>
-          <w:szCs w:val="28"/>
-        </w:rPr>
-        <w:t xml:space="preserve">- ?????????? ?????????? ??????????: Java Swing;</w:t>
-      </w:r>
-    </w:p>
-    <w:p>
-      <w:pPr>
-        <w:spacing w:after="80" w:line="360" w:lineRule="auto"/>
-      </w:pPr>
-      <w:r>
-        <w:rPr>
-          <w:rFonts w:ascii="Times New Roman" w:hAnsi="Times New Roman" w:cs="Times New Roman"/>
-          <w:sz w:val="28"/>
-          <w:szCs w:val="28"/>
-        </w:rPr>
-        <w:t xml:space="preserve">- ??????? ???????? ??????: Git;</w:t>
-      </w:r>
-    </w:p>
-    <w:p>
-      <w:pPr>
-        <w:spacing w:after="80" w:line="360" w:lineRule="auto"/>
-      </w:pPr>
-      <w:r>
-        <w:rPr>
-          <w:rFonts w:ascii="Times New Roman" w:hAnsi="Times New Roman" w:cs="Times New Roman"/>
-          <w:sz w:val="28"/>
-          <w:szCs w:val="28"/>
-        </w:rPr>
-        <w:t xml:space="preserve">- ?????????? ???????: Windows, PowerShell;</w:t>
-      </w:r>
-    </w:p>
-    <w:p>
-      <w:pPr>
-        <w:spacing w:after="80" w:line="360" w:lineRule="auto"/>
-      </w:pPr>
-      <w:r>
-        <w:rPr>
-          <w:rFonts w:ascii="Times New Roman" w:hAnsi="Times New Roman" w:cs="Times New Roman"/>
-          <w:sz w:val="28"/>
-          <w:szCs w:val="28"/>
-        </w:rPr>
-        <w:t xml:space="preserve">- ????????/?????? ?????: D:\labs\java_project.</w:t>
-      </w:r>
+        <w:t xml:space="preserve">Засоби розроблення</w:t>
+      </w:r>
+    </w:p>
+    <w:p>
+      <w:pPr>
+        <w:spacing w:after="60" w:line="360" w:lineRule="auto"/>
+      </w:pPr>
+    </w:p>
+    <w:p>
+      <w:pPr>
+        <w:spacing w:after="80" w:line="360" w:lineRule="auto"/>
+      </w:pPr>
+      <w:r>
+        <w:rPr>
+          <w:rFonts w:ascii="Times New Roman" w:hAnsi="Times New Roman" w:cs="Times New Roman"/>
+          <w:sz w:val="28"/>
+          <w:szCs w:val="28"/>
+        </w:rPr>
+        <w:t xml:space="preserve">- Мова програмування: Java 21.</w:t>
+      </w:r>
+    </w:p>
+    <w:p>
+      <w:pPr>
+        <w:spacing w:after="80" w:line="360" w:lineRule="auto"/>
+      </w:pPr>
+      <w:r>
+        <w:rPr>
+          <w:rFonts w:ascii="Times New Roman" w:hAnsi="Times New Roman" w:cs="Times New Roman"/>
+          <w:sz w:val="28"/>
+          <w:szCs w:val="28"/>
+        </w:rPr>
+        <w:t xml:space="preserve">- Бібліотека графічного інтерфейсу: Java Swing.</w:t>
+      </w:r>
+    </w:p>
+    <w:p>
+      <w:pPr>
+        <w:spacing w:after="80" w:line="360" w:lineRule="auto"/>
+      </w:pPr>
+      <w:r>
+        <w:rPr>
+          <w:rFonts w:ascii="Times New Roman" w:hAnsi="Times New Roman" w:cs="Times New Roman"/>
+          <w:sz w:val="28"/>
+          <w:szCs w:val="28"/>
+        </w:rPr>
+        <w:t xml:space="preserve">- Система контролю версій: Git.</w:t>
+      </w:r>
+    </w:p>
+    <w:p>
+      <w:pPr>
+        <w:spacing w:after="80" w:line="360" w:lineRule="auto"/>
+      </w:pPr>
+      <w:r>
+        <w:rPr>
+          <w:rFonts w:ascii="Times New Roman" w:hAnsi="Times New Roman" w:cs="Times New Roman"/>
+          <w:sz w:val="28"/>
+          <w:szCs w:val="28"/>
+        </w:rPr>
+        <w:t xml:space="preserve">- Середовище запуску: Windows, PowerShell.</w:t>
+      </w:r>
+    </w:p>
+    <w:p>
+      <w:pPr>
+        <w:spacing w:after="60" w:line="360" w:lineRule="auto"/>
+      </w:pPr>
     </w:p>
     <w:p>
       <w:pPr>
@@ -287,36 +281,96 @@
           <w:b/>
           <w:bCs/>
         </w:rPr>
-        <w:t xml:space="preserve">???? ?????? ????????</w:t>
-      </w:r>
-    </w:p>
-    <w:p>
-      <w:pPr>
-        <w:ind w:firstLine="708"/>
-        <w:spacing w:after="120" w:line="360" w:lineRule="auto"/>
-      </w:pPr>
-      <w:r>
-        <w:rPr>
-          <w:rFonts w:ascii="Times New Roman" w:hAnsi="Times New Roman" w:cs="Times New Roman"/>
-          <w:sz w:val="28"/>
-          <w:szCs w:val="28"/>
-        </w:rPr>
-        <w:t xml:space="preserve">? ????????? ????? ?????????? ???????? ????? ? ??????????? ???????. ??? ?????????? ???????? ??????? ?????????, ??????, ?????, ????????? ??????, ??????, ?????, ?????? ??????, ?????????? ????? ? ????????? ?????.</w:t>
-      </w:r>
-    </w:p>
-    <w:p>
-      <w:pPr>
-        <w:ind w:firstLine="708"/>
-        <w:spacing w:after="120" w:line="360" w:lineRule="auto"/>
-      </w:pPr>
-      <w:r>
-        <w:rPr>
-          <w:rFonts w:ascii="Times New Roman" w:hAnsi="Times New Roman" w:cs="Times New Roman"/>
-          <w:sz w:val="28"/>
-          <w:szCs w:val="28"/>
-        </w:rPr>
-        <w:t xml:space="preserve">????? ?????????? ?????? ???????????? ????????? ???????? ???????? ???? ??? ??????? ???? ????? ? ???????? ????????? ? ???????. ?? ??????? ??????? ?????????? ????????? ???????? ?? ????????????? ???? ???????.</w:t>
-      </w:r>
+        <w:t xml:space="preserve">Опис роботи програми</w:t>
+      </w:r>
+    </w:p>
+    <w:p>
+      <w:pPr>
+        <w:spacing w:after="60" w:line="360" w:lineRule="auto"/>
+      </w:pPr>
+    </w:p>
+    <w:p>
+      <w:pPr>
+        <w:spacing w:after="80" w:line="360" w:lineRule="auto"/>
+      </w:pPr>
+      <w:r>
+        <w:rPr>
+          <w:rFonts w:ascii="Times New Roman" w:hAnsi="Times New Roman" w:cs="Times New Roman"/>
+          <w:sz w:val="28"/>
+          <w:szCs w:val="28"/>
+        </w:rPr>
+        <w:t xml:space="preserve">1. Користувач заповнює параметри ремонту в лівій частині вікна.</w:t>
+      </w:r>
+    </w:p>
+    <w:p>
+      <w:pPr>
+        <w:spacing w:after="80" w:line="360" w:lineRule="auto"/>
+      </w:pPr>
+      <w:r>
+        <w:rPr>
+          <w:rFonts w:ascii="Times New Roman" w:hAnsi="Times New Roman" w:cs="Times New Roman"/>
+          <w:sz w:val="28"/>
+          <w:szCs w:val="28"/>
+        </w:rPr>
+        <w:t xml:space="preserve">2. У списку вибирає потрібні види робіт.</w:t>
+      </w:r>
+    </w:p>
+    <w:p>
+      <w:pPr>
+        <w:spacing w:after="80" w:line="360" w:lineRule="auto"/>
+      </w:pPr>
+      <w:r>
+        <w:rPr>
+          <w:rFonts w:ascii="Times New Roman" w:hAnsi="Times New Roman" w:cs="Times New Roman"/>
+          <w:sz w:val="28"/>
+          <w:szCs w:val="28"/>
+        </w:rPr>
+        <w:t xml:space="preserve">3. Натискає кнопку Розрахувати кошторис.</w:t>
+      </w:r>
+    </w:p>
+    <w:p>
+      <w:pPr>
+        <w:spacing w:after="80" w:line="360" w:lineRule="auto"/>
+      </w:pPr>
+      <w:r>
+        <w:rPr>
+          <w:rFonts w:ascii="Times New Roman" w:hAnsi="Times New Roman" w:cs="Times New Roman"/>
+          <w:sz w:val="28"/>
+          <w:szCs w:val="28"/>
+        </w:rPr>
+        <w:t xml:space="preserve">4. На вкладці Кошторис відображається таблиця з деталізацією.</w:t>
+      </w:r>
+    </w:p>
+    <w:p>
+      <w:pPr>
+        <w:spacing w:after="80" w:line="360" w:lineRule="auto"/>
+      </w:pPr>
+      <w:r>
+        <w:rPr>
+          <w:rFonts w:ascii="Times New Roman" w:hAnsi="Times New Roman" w:cs="Times New Roman"/>
+          <w:sz w:val="28"/>
+          <w:szCs w:val="28"/>
+        </w:rPr>
+        <w:t xml:space="preserve">5. На вкладці Підсумок формується текстовий звіт.</w:t>
+      </w:r>
+    </w:p>
+    <w:p>
+      <w:pPr>
+        <w:spacing w:after="80" w:line="360" w:lineRule="auto"/>
+      </w:pPr>
+      <w:r>
+        <w:rPr>
+          <w:rFonts w:ascii="Times New Roman" w:hAnsi="Times New Roman" w:cs="Times New Roman"/>
+          <w:sz w:val="28"/>
+          <w:szCs w:val="28"/>
+        </w:rPr>
+        <w:t xml:space="preserve">6. Через кнопку Експорт можна зберегти кошторис у текстовий файл.</w:t>
+      </w:r>
+    </w:p>
+    <w:p>
+      <w:pPr>
+        <w:spacing w:after="60" w:line="360" w:lineRule="auto"/>
+      </w:pPr>
     </w:p>
     <w:p>
       <w:pPr>
@@ -330,8 +384,357 @@
           <w:b/>
           <w:bCs/>
         </w:rPr>
-        <w:t xml:space="preserve">????????? ?????? ????????</w:t>
-      </w:r>
+        <w:t xml:space="preserve">Використані компоненти інтерфейсу</w:t>
+      </w:r>
+    </w:p>
+    <w:p>
+      <w:pPr>
+        <w:spacing w:after="60" w:line="360" w:lineRule="auto"/>
+      </w:pPr>
+    </w:p>
+    <w:p>
+      <w:pPr>
+        <w:ind w:firstLine="708"/>
+        <w:spacing w:after="120" w:line="360" w:lineRule="auto"/>
+      </w:pPr>
+      <w:r>
+        <w:rPr>
+          <w:rFonts w:ascii="Times New Roman" w:hAnsi="Times New Roman" w:cs="Times New Roman"/>
+          <w:sz w:val="28"/>
+          <w:szCs w:val="28"/>
+        </w:rPr>
+        <w:t xml:space="preserve">У застосунку використано більше ніж 5 типів компонентів:</w:t>
+      </w:r>
+    </w:p>
+    <w:p>
+      <w:pPr>
+        <w:spacing w:after="60" w:line="360" w:lineRule="auto"/>
+      </w:pPr>
+    </w:p>
+    <w:p>
+      <w:pPr>
+        <w:spacing w:after="80" w:line="360" w:lineRule="auto"/>
+      </w:pPr>
+      <w:r>
+        <w:rPr>
+          <w:rFonts w:ascii="Times New Roman" w:hAnsi="Times New Roman" w:cs="Times New Roman"/>
+          <w:sz w:val="28"/>
+          <w:szCs w:val="28"/>
+        </w:rPr>
+        <w:t xml:space="preserve">- JFrame - головне вікно програми.</w:t>
+      </w:r>
+    </w:p>
+    <w:p>
+      <w:pPr>
+        <w:spacing w:after="80" w:line="360" w:lineRule="auto"/>
+      </w:pPr>
+      <w:r>
+        <w:rPr>
+          <w:rFonts w:ascii="Times New Roman" w:hAnsi="Times New Roman" w:cs="Times New Roman"/>
+          <w:sz w:val="28"/>
+          <w:szCs w:val="28"/>
+        </w:rPr>
+        <w:t xml:space="preserve">- JPanel - групування елементів інтерфейсу.</w:t>
+      </w:r>
+    </w:p>
+    <w:p>
+      <w:pPr>
+        <w:spacing w:after="80" w:line="360" w:lineRule="auto"/>
+      </w:pPr>
+      <w:r>
+        <w:rPr>
+          <w:rFonts w:ascii="Times New Roman" w:hAnsi="Times New Roman" w:cs="Times New Roman"/>
+          <w:sz w:val="28"/>
+          <w:szCs w:val="28"/>
+        </w:rPr>
+        <w:t xml:space="preserve">- JLabel - підписи та заголовки.</w:t>
+      </w:r>
+    </w:p>
+    <w:p>
+      <w:pPr>
+        <w:spacing w:after="80" w:line="360" w:lineRule="auto"/>
+      </w:pPr>
+      <w:r>
+        <w:rPr>
+          <w:rFonts w:ascii="Times New Roman" w:hAnsi="Times New Roman" w:cs="Times New Roman"/>
+          <w:sz w:val="28"/>
+          <w:szCs w:val="28"/>
+        </w:rPr>
+        <w:t xml:space="preserve">- JTextField - введення замовника й об'єкта.</w:t>
+      </w:r>
+    </w:p>
+    <w:p>
+      <w:pPr>
+        <w:spacing w:after="80" w:line="360" w:lineRule="auto"/>
+      </w:pPr>
+      <w:r>
+        <w:rPr>
+          <w:rFonts w:ascii="Times New Roman" w:hAnsi="Times New Roman" w:cs="Times New Roman"/>
+          <w:sz w:val="28"/>
+          <w:szCs w:val="28"/>
+        </w:rPr>
+        <w:t xml:space="preserve">- JSpinner - введення площі, кімнат і бюджету.</w:t>
+      </w:r>
+    </w:p>
+    <w:p>
+      <w:pPr>
+        <w:spacing w:after="80" w:line="360" w:lineRule="auto"/>
+      </w:pPr>
+      <w:r>
+        <w:rPr>
+          <w:rFonts w:ascii="Times New Roman" w:hAnsi="Times New Roman" w:cs="Times New Roman"/>
+          <w:sz w:val="28"/>
+          <w:szCs w:val="28"/>
+        </w:rPr>
+        <w:t xml:space="preserve">- JComboBox - вибір міста та рівня якості.</w:t>
+      </w:r>
+    </w:p>
+    <w:p>
+      <w:pPr>
+        <w:spacing w:after="80" w:line="360" w:lineRule="auto"/>
+      </w:pPr>
+      <w:r>
+        <w:rPr>
+          <w:rFonts w:ascii="Times New Roman" w:hAnsi="Times New Roman" w:cs="Times New Roman"/>
+          <w:sz w:val="28"/>
+          <w:szCs w:val="28"/>
+        </w:rPr>
+        <w:t xml:space="preserve">- JCheckBox - додаткові опції кошторису.</w:t>
+      </w:r>
+    </w:p>
+    <w:p>
+      <w:pPr>
+        <w:spacing w:after="80" w:line="360" w:lineRule="auto"/>
+      </w:pPr>
+      <w:r>
+        <w:rPr>
+          <w:rFonts w:ascii="Times New Roman" w:hAnsi="Times New Roman" w:cs="Times New Roman"/>
+          <w:sz w:val="28"/>
+          <w:szCs w:val="28"/>
+        </w:rPr>
+        <w:t xml:space="preserve">- JRadioButton - вибір типу об'єкта.</w:t>
+      </w:r>
+    </w:p>
+    <w:p>
+      <w:pPr>
+        <w:spacing w:after="80" w:line="360" w:lineRule="auto"/>
+      </w:pPr>
+      <w:r>
+        <w:rPr>
+          <w:rFonts w:ascii="Times New Roman" w:hAnsi="Times New Roman" w:cs="Times New Roman"/>
+          <w:sz w:val="28"/>
+          <w:szCs w:val="28"/>
+        </w:rPr>
+        <w:t xml:space="preserve">- JSlider - вибір складності.</w:t>
+      </w:r>
+    </w:p>
+    <w:p>
+      <w:pPr>
+        <w:spacing w:after="80" w:line="360" w:lineRule="auto"/>
+      </w:pPr>
+      <w:r>
+        <w:rPr>
+          <w:rFonts w:ascii="Times New Roman" w:hAnsi="Times New Roman" w:cs="Times New Roman"/>
+          <w:sz w:val="28"/>
+          <w:szCs w:val="28"/>
+        </w:rPr>
+        <w:t xml:space="preserve">- JList - вибір видів робіт.</w:t>
+      </w:r>
+    </w:p>
+    <w:p>
+      <w:pPr>
+        <w:spacing w:after="80" w:line="360" w:lineRule="auto"/>
+      </w:pPr>
+      <w:r>
+        <w:rPr>
+          <w:rFonts w:ascii="Times New Roman" w:hAnsi="Times New Roman" w:cs="Times New Roman"/>
+          <w:sz w:val="28"/>
+          <w:szCs w:val="28"/>
+        </w:rPr>
+        <w:t xml:space="preserve">- JTable - таблиця кошторису.</w:t>
+      </w:r>
+    </w:p>
+    <w:p>
+      <w:pPr>
+        <w:spacing w:after="80" w:line="360" w:lineRule="auto"/>
+      </w:pPr>
+      <w:r>
+        <w:rPr>
+          <w:rFonts w:ascii="Times New Roman" w:hAnsi="Times New Roman" w:cs="Times New Roman"/>
+          <w:sz w:val="28"/>
+          <w:szCs w:val="28"/>
+        </w:rPr>
+        <w:t xml:space="preserve">- JTextArea - текстовий підсумок.</w:t>
+      </w:r>
+    </w:p>
+    <w:p>
+      <w:pPr>
+        <w:spacing w:after="80" w:line="360" w:lineRule="auto"/>
+      </w:pPr>
+      <w:r>
+        <w:rPr>
+          <w:rFonts w:ascii="Times New Roman" w:hAnsi="Times New Roman" w:cs="Times New Roman"/>
+          <w:sz w:val="28"/>
+          <w:szCs w:val="28"/>
+        </w:rPr>
+        <w:t xml:space="preserve">- JButton - виконання команд.</w:t>
+      </w:r>
+    </w:p>
+    <w:p>
+      <w:pPr>
+        <w:spacing w:after="80" w:line="360" w:lineRule="auto"/>
+      </w:pPr>
+      <w:r>
+        <w:rPr>
+          <w:rFonts w:ascii="Times New Roman" w:hAnsi="Times New Roman" w:cs="Times New Roman"/>
+          <w:sz w:val="28"/>
+          <w:szCs w:val="28"/>
+        </w:rPr>
+        <w:t xml:space="preserve">- JTabbedPane - вкладки результатів.</w:t>
+      </w:r>
+    </w:p>
+    <w:p>
+      <w:pPr>
+        <w:spacing w:after="80" w:line="360" w:lineRule="auto"/>
+      </w:pPr>
+      <w:r>
+        <w:rPr>
+          <w:rFonts w:ascii="Times New Roman" w:hAnsi="Times New Roman" w:cs="Times New Roman"/>
+          <w:sz w:val="28"/>
+          <w:szCs w:val="28"/>
+        </w:rPr>
+        <w:t xml:space="preserve">- JProgressBar - показ використання бюджету.</w:t>
+      </w:r>
+    </w:p>
+    <w:p>
+      <w:pPr>
+        <w:spacing w:after="80" w:line="360" w:lineRule="auto"/>
+      </w:pPr>
+      <w:r>
+        <w:rPr>
+          <w:rFonts w:ascii="Times New Roman" w:hAnsi="Times New Roman" w:cs="Times New Roman"/>
+          <w:sz w:val="28"/>
+          <w:szCs w:val="28"/>
+        </w:rPr>
+        <w:t xml:space="preserve">- JMenuBar - меню програми.</w:t>
+      </w:r>
+    </w:p>
+    <w:p>
+      <w:pPr>
+        <w:spacing w:after="80" w:line="360" w:lineRule="auto"/>
+      </w:pPr>
+      <w:r>
+        <w:rPr>
+          <w:rFonts w:ascii="Times New Roman" w:hAnsi="Times New Roman" w:cs="Times New Roman"/>
+          <w:sz w:val="28"/>
+          <w:szCs w:val="28"/>
+        </w:rPr>
+        <w:t xml:space="preserve">- JFileChooser - вибір файлу для експорту.</w:t>
+      </w:r>
+    </w:p>
+    <w:p>
+      <w:pPr>
+        <w:spacing w:after="60" w:line="360" w:lineRule="auto"/>
+      </w:pPr>
+    </w:p>
+    <w:p>
+      <w:pPr>
+        <w:spacing w:after="120" w:line="360" w:lineRule="auto"/>
+      </w:pPr>
+      <w:r>
+        <w:rPr>
+          <w:rFonts w:ascii="Times New Roman" w:hAnsi="Times New Roman" w:cs="Times New Roman"/>
+          <w:sz w:val="28"/>
+          <w:szCs w:val="28"/>
+          <w:b/>
+          <w:bCs/>
+        </w:rPr>
+        <w:t xml:space="preserve">Формула розрахунку</w:t>
+      </w:r>
+    </w:p>
+    <w:p>
+      <w:pPr>
+        <w:spacing w:after="60" w:line="360" w:lineRule="auto"/>
+      </w:pPr>
+    </w:p>
+    <w:p>
+      <w:pPr>
+        <w:ind w:firstLine="708"/>
+        <w:spacing w:after="120" w:line="360" w:lineRule="auto"/>
+      </w:pPr>
+      <w:r>
+        <w:rPr>
+          <w:rFonts w:ascii="Times New Roman" w:hAnsi="Times New Roman" w:cs="Times New Roman"/>
+          <w:sz w:val="28"/>
+          <w:szCs w:val="28"/>
+        </w:rPr>
+        <w:t xml:space="preserve">Основна сума для кожного виду робіт:</w:t>
+      </w:r>
+    </w:p>
+    <w:p>
+      <w:pPr>
+        <w:spacing w:after="60" w:line="360" w:lineRule="auto"/>
+      </w:pPr>
+    </w:p>
+    <w:p>
+      <w:pPr>
+        <w:jc w:val="center"/>
+        <w:spacing w:after="120" w:line="360" w:lineRule="auto"/>
+      </w:pPr>
+      <w:r>
+        <w:rPr>
+          <w:rFonts w:ascii="Times New Roman" w:hAnsi="Times New Roman" w:cs="Times New Roman"/>
+          <w:sz w:val="28"/>
+          <w:szCs w:val="28"/>
+          <w:i/>
+          <w:iCs/>
+        </w:rPr>
+        <w:t xml:space="preserve">сума = обсяг * ціна_за_одиницю * коефіцієнт_якості * коефіцієнт_міста * коефіцієнт_типу_об'єкта * коефіцієнт_складності * коефіцієнт_кімнат</w:t>
+      </w:r>
+    </w:p>
+    <w:p>
+      <w:pPr>
+        <w:spacing w:after="60" w:line="360" w:lineRule="auto"/>
+      </w:pPr>
+    </w:p>
+    <w:p>
+      <w:pPr>
+        <w:ind w:firstLine="708"/>
+        <w:spacing w:after="120" w:line="360" w:lineRule="auto"/>
+      </w:pPr>
+      <w:r>
+        <w:rPr>
+          <w:rFonts w:ascii="Times New Roman" w:hAnsi="Times New Roman" w:cs="Times New Roman"/>
+          <w:sz w:val="28"/>
+          <w:szCs w:val="28"/>
+        </w:rPr>
+        <w:t xml:space="preserve">Після цього додаються додаткові нарахування: терміновість, дизайн-супровід і резерв матеріалів.</w:t>
+      </w:r>
+    </w:p>
+    <w:p>
+      <w:pPr>
+        <w:spacing w:after="60" w:line="360" w:lineRule="auto"/>
+      </w:pPr>
+    </w:p>
+    <w:p>
+      <w:pPr>
+        <w:spacing w:after="120" w:line="360" w:lineRule="auto"/>
+      </w:pPr>
+      <w:r>
+        <w:rPr>
+          <w:rFonts w:ascii="Times New Roman" w:hAnsi="Times New Roman" w:cs="Times New Roman"/>
+          <w:sz w:val="28"/>
+          <w:szCs w:val="28"/>
+          <w:b/>
+          <w:bCs/>
+        </w:rPr>
+        <w:t xml:space="preserve">Скриншоти роботи</w:t>
+      </w:r>
+    </w:p>
+    <w:p>
+      <w:pPr>
+        <w:spacing w:after="60" w:line="360" w:lineRule="auto"/>
+      </w:pPr>
     </w:p>
     <w:tbl>
       <w:tblPr>
@@ -341,8 +744,6 @@
           <w:left w:val="single" w:sz="12" w:space="0" w:color="808080"/>
           <w:bottom w:val="single" w:sz="12" w:space="0" w:color="808080"/>
           <w:right w:val="single" w:sz="12" w:space="0" w:color="808080"/>
-          <w:insideH w:val="single" w:sz="4" w:space="0" w:color="D9D9D9"/>
-          <w:insideV w:val="single" w:sz="4" w:space="0" w:color="D9D9D9"/>
         </w:tblBorders>
       </w:tblPr>
       <w:tr>
@@ -367,7 +768,7 @@
                 <w:b/>
                 <w:bCs/>
               </w:rPr>
-              <w:t xml:space="preserve">??????? 1 - ?????????? ????? ????????</w:t>
+              <w:t xml:space="preserve">Рисунок 1 - Початковий екран</w:t>
             </w:r>
           </w:p>
           <w:p>
@@ -383,7 +784,7 @@
                 <w:i/>
                 <w:iCs/>
               </w:rPr>
-              <w:t xml:space="preserve">????? ??? ?????????</w:t>
+              <w:t xml:space="preserve">Місце для скриншота</w:t>
             </w:r>
           </w:p>
         </w:tc>
@@ -392,6 +793,16 @@
     <w:p>
       <w:pPr>
         <w:spacing w:after="160" w:line="360" w:lineRule="auto"/>
+      </w:pPr>
+    </w:p>
+    <w:p>
+      <w:pPr>
+        <w:spacing w:after="60" w:line="360" w:lineRule="auto"/>
+      </w:pPr>
+    </w:p>
+    <w:p>
+      <w:pPr>
+        <w:spacing w:after="60" w:line="360" w:lineRule="auto"/>
       </w:pPr>
     </w:p>
     <w:tbl>
@@ -402,8 +813,6 @@
           <w:left w:val="single" w:sz="12" w:space="0" w:color="808080"/>
           <w:bottom w:val="single" w:sz="12" w:space="0" w:color="808080"/>
           <w:right w:val="single" w:sz="12" w:space="0" w:color="808080"/>
-          <w:insideH w:val="single" w:sz="4" w:space="0" w:color="D9D9D9"/>
-          <w:insideV w:val="single" w:sz="4" w:space="0" w:color="D9D9D9"/>
         </w:tblBorders>
       </w:tblPr>
       <w:tr>
@@ -428,7 +837,7 @@
                 <w:b/>
                 <w:bCs/>
               </w:rPr>
-              <w:t xml:space="preserve">??????? 2 - ??????? ????????????? ?????????</w:t>
+              <w:t xml:space="preserve">Рисунок 2 - Приклад розрахованого кошторису</w:t>
             </w:r>
           </w:p>
           <w:p>
@@ -444,7 +853,7 @@
                 <w:i/>
                 <w:iCs/>
               </w:rPr>
-              <w:t xml:space="preserve">????? ??? ?????????</w:t>
+              <w:t xml:space="preserve">Місце для скриншота</w:t>
             </w:r>
           </w:p>
         </w:tc>
@@ -457,6 +866,16 @@
     </w:p>
     <w:p>
       <w:pPr>
+        <w:spacing w:after="60" w:line="360" w:lineRule="auto"/>
+      </w:pPr>
+    </w:p>
+    <w:p>
+      <w:pPr>
+        <w:spacing w:after="60" w:line="360" w:lineRule="auto"/>
+      </w:pPr>
+    </w:p>
+    <w:p>
+      <w:pPr>
         <w:spacing w:after="120" w:line="360" w:lineRule="auto"/>
       </w:pPr>
       <w:r>
@@ -467,8 +886,13 @@
           <w:b/>
           <w:bCs/>
         </w:rPr>
-        <w:t xml:space="preserve">??????????? ?????????? ??????????</w:t>
-      </w:r>
+        <w:t xml:space="preserve">Посилання на репозиторій</w:t>
+      </w:r>
+    </w:p>
+    <w:p>
+      <w:pPr>
+        <w:spacing w:after="60" w:line="360" w:lineRule="auto"/>
+      </w:pPr>
     </w:p>
     <w:p>
       <w:pPr>
@@ -481,216 +905,13 @@
           <w:sz w:val="28"/>
           <w:szCs w:val="28"/>
         </w:rPr>
-        <w:t xml:space="preserve">? ?????????? ??????????? ???? ?????????? Java Swing:</w:t>
-      </w:r>
-    </w:p>
-    <w:p>
-      <w:pPr>
-        <w:spacing w:after="80" w:line="360" w:lineRule="auto"/>
-      </w:pPr>
-      <w:r>
-        <w:rPr>
-          <w:rFonts w:ascii="Times New Roman" w:hAnsi="Times New Roman" w:cs="Times New Roman"/>
-          <w:sz w:val="28"/>
-          <w:szCs w:val="28"/>
-        </w:rPr>
-        <w:t xml:space="preserve">- JFrame - ??????? ????? ????????;</w:t>
-      </w:r>
-    </w:p>
-    <w:p>
-      <w:pPr>
-        <w:spacing w:after="80" w:line="360" w:lineRule="auto"/>
-      </w:pPr>
-      <w:r>
-        <w:rPr>
-          <w:rFonts w:ascii="Times New Roman" w:hAnsi="Times New Roman" w:cs="Times New Roman"/>
-          <w:sz w:val="28"/>
-          <w:szCs w:val="28"/>
-        </w:rPr>
-        <w:t xml:space="preserve">- JPanel - ?????????? ?? ?????????? ?????????;</w:t>
-      </w:r>
-    </w:p>
-    <w:p>
-      <w:pPr>
-        <w:spacing w:after="80" w:line="360" w:lineRule="auto"/>
-      </w:pPr>
-      <w:r>
-        <w:rPr>
-          <w:rFonts w:ascii="Times New Roman" w:hAnsi="Times New Roman" w:cs="Times New Roman"/>
-          <w:sz w:val="28"/>
-          <w:szCs w:val="28"/>
-        </w:rPr>
-        <w:t xml:space="preserve">- JLabel - ??????? ? ?????????;</w:t>
-      </w:r>
-    </w:p>
-    <w:p>
-      <w:pPr>
-        <w:spacing w:after="80" w:line="360" w:lineRule="auto"/>
-      </w:pPr>
-      <w:r>
-        <w:rPr>
-          <w:rFonts w:ascii="Times New Roman" w:hAnsi="Times New Roman" w:cs="Times New Roman"/>
-          <w:sz w:val="28"/>
-          <w:szCs w:val="28"/>
-        </w:rPr>
-        <w:t xml:space="preserve">- JTextField - ???????? ????????? ?????;</w:t>
-      </w:r>
-    </w:p>
-    <w:p>
-      <w:pPr>
-        <w:spacing w:after="80" w:line="360" w:lineRule="auto"/>
-      </w:pPr>
-      <w:r>
-        <w:rPr>
-          <w:rFonts w:ascii="Times New Roman" w:hAnsi="Times New Roman" w:cs="Times New Roman"/>
-          <w:sz w:val="28"/>
-          <w:szCs w:val="28"/>
-        </w:rPr>
-        <w:t xml:space="preserve">- JSpinner - ???????? ???????? ???????;</w:t>
-      </w:r>
-    </w:p>
-    <w:p>
-      <w:pPr>
-        <w:spacing w:after="80" w:line="360" w:lineRule="auto"/>
-      </w:pPr>
-      <w:r>
-        <w:rPr>
-          <w:rFonts w:ascii="Times New Roman" w:hAnsi="Times New Roman" w:cs="Times New Roman"/>
-          <w:sz w:val="28"/>
-          <w:szCs w:val="28"/>
-        </w:rPr>
-        <w:t xml:space="preserve">- JComboBox - ????? ????? ?? ????? ??????;</w:t>
-      </w:r>
-    </w:p>
-    <w:p>
-      <w:pPr>
-        <w:spacing w:after="80" w:line="360" w:lineRule="auto"/>
-      </w:pPr>
-      <w:r>
-        <w:rPr>
-          <w:rFonts w:ascii="Times New Roman" w:hAnsi="Times New Roman" w:cs="Times New Roman"/>
-          <w:sz w:val="28"/>
-          <w:szCs w:val="28"/>
-        </w:rPr>
-        <w:t xml:space="preserve">- JCheckBox - ????????? ????????? ?????????;</w:t>
-      </w:r>
-    </w:p>
-    <w:p>
-      <w:pPr>
-        <w:spacing w:after="80" w:line="360" w:lineRule="auto"/>
-      </w:pPr>
-      <w:r>
-        <w:rPr>
-          <w:rFonts w:ascii="Times New Roman" w:hAnsi="Times New Roman" w:cs="Times New Roman"/>
-          <w:sz w:val="28"/>
-          <w:szCs w:val="28"/>
-        </w:rPr>
-        <w:t xml:space="preserve">- JRadioButton - ????? ???? ???????;</w:t>
-      </w:r>
-    </w:p>
-    <w:p>
-      <w:pPr>
-        <w:spacing w:after="80" w:line="360" w:lineRule="auto"/>
-      </w:pPr>
-      <w:r>
-        <w:rPr>
-          <w:rFonts w:ascii="Times New Roman" w:hAnsi="Times New Roman" w:cs="Times New Roman"/>
-          <w:sz w:val="28"/>
-          <w:szCs w:val="28"/>
-        </w:rPr>
-        <w:t xml:space="preserve">- JSlider - ????? ?????????? ?????;</w:t>
-      </w:r>
-    </w:p>
-    <w:p>
-      <w:pPr>
-        <w:spacing w:after="80" w:line="360" w:lineRule="auto"/>
-      </w:pPr>
-      <w:r>
-        <w:rPr>
-          <w:rFonts w:ascii="Times New Roman" w:hAnsi="Times New Roman" w:cs="Times New Roman"/>
-          <w:sz w:val="28"/>
-          <w:szCs w:val="28"/>
-        </w:rPr>
-        <w:t xml:space="preserve">- JList - ????? ????? ?????;</w:t>
-      </w:r>
-    </w:p>
-    <w:p>
-      <w:pPr>
-        <w:spacing w:after="80" w:line="360" w:lineRule="auto"/>
-      </w:pPr>
-      <w:r>
-        <w:rPr>
-          <w:rFonts w:ascii="Times New Roman" w:hAnsi="Times New Roman" w:cs="Times New Roman"/>
-          <w:sz w:val="28"/>
-          <w:szCs w:val="28"/>
-        </w:rPr>
-        <w:t xml:space="preserve">- JTable - ???????????? ?????????????? ?????????;</w:t>
-      </w:r>
-    </w:p>
-    <w:p>
-      <w:pPr>
-        <w:spacing w:after="80" w:line="360" w:lineRule="auto"/>
-      </w:pPr>
-      <w:r>
-        <w:rPr>
-          <w:rFonts w:ascii="Times New Roman" w:hAnsi="Times New Roman" w:cs="Times New Roman"/>
-          <w:sz w:val="28"/>
-          <w:szCs w:val="28"/>
-        </w:rPr>
-        <w:t xml:space="preserve">- JTextArea - ????????? ????????;</w:t>
-      </w:r>
-    </w:p>
-    <w:p>
-      <w:pPr>
-        <w:spacing w:after="80" w:line="360" w:lineRule="auto"/>
-      </w:pPr>
-      <w:r>
-        <w:rPr>
-          <w:rFonts w:ascii="Times New Roman" w:hAnsi="Times New Roman" w:cs="Times New Roman"/>
-          <w:sz w:val="28"/>
-          <w:szCs w:val="28"/>
-        </w:rPr>
-        <w:t xml:space="preserve">- JButton - ?????? ??????;</w:t>
-      </w:r>
-    </w:p>
-    <w:p>
-      <w:pPr>
-        <w:spacing w:after="80" w:line="360" w:lineRule="auto"/>
-      </w:pPr>
-      <w:r>
-        <w:rPr>
-          <w:rFonts w:ascii="Times New Roman" w:hAnsi="Times New Roman" w:cs="Times New Roman"/>
-          <w:sz w:val="28"/>
-          <w:szCs w:val="28"/>
-        </w:rPr>
-        <w:t xml:space="preserve">- JTabbedPane - ??????? ???????????;</w:t>
-      </w:r>
-    </w:p>
-    <w:p>
-      <w:pPr>
-        <w:spacing w:after="80" w:line="360" w:lineRule="auto"/>
-      </w:pPr>
-      <w:r>
-        <w:rPr>
-          <w:rFonts w:ascii="Times New Roman" w:hAnsi="Times New Roman" w:cs="Times New Roman"/>
-          <w:sz w:val="28"/>
-          <w:szCs w:val="28"/>
-        </w:rPr>
-        <w:t xml:space="preserve">- JProgressBar - ????????? ???????????? ???????;</w:t>
-      </w:r>
-    </w:p>
-    <w:p>
-      <w:pPr>
-        <w:spacing w:after="80" w:line="360" w:lineRule="auto"/>
-      </w:pPr>
-      <w:r>
-        <w:rPr>
-          <w:rFonts w:ascii="Times New Roman" w:hAnsi="Times New Roman" w:cs="Times New Roman"/>
-          <w:sz w:val="28"/>
-          <w:szCs w:val="28"/>
-        </w:rPr>
-        <w:t xml:space="preserve">- JMenuBar ? JFileChooser - ???? ???????? ?? ??????? ?????.</w:t>
-      </w:r>
+        <w:t xml:space="preserve">GitHub: https://github.com/FunkyPotato7/java_project</w:t>
+      </w:r>
+    </w:p>
+    <w:p>
+      <w:pPr>
+        <w:spacing w:after="60" w:line="360" w:lineRule="auto"/>
+      </w:pPr>
     </w:p>
     <w:p>
       <w:pPr>
@@ -704,8 +925,13 @@
           <w:b/>
           <w:bCs/>
         </w:rPr>
-        <w:t xml:space="preserve">??????? ??????????</w:t>
-      </w:r>
+        <w:t xml:space="preserve">Висновок</w:t>
+      </w:r>
+    </w:p>
+    <w:p>
+      <w:pPr>
+        <w:spacing w:after="60" w:line="360" w:lineRule="auto"/>
+      </w:pPr>
     </w:p>
     <w:p>
       <w:pPr>
@@ -718,117 +944,15 @@
           <w:sz w:val="28"/>
           <w:szCs w:val="28"/>
         </w:rPr>
-        <w:t xml:space="preserve">??????? ???? ??? ??????? ???? ????? ???????????? ?? ????????:</w:t>
-      </w:r>
-    </w:p>
-    <w:p>
-      <w:pPr>
-        <w:jc w:val="center"/>
-        <w:spacing w:after="120" w:line="360" w:lineRule="auto"/>
-      </w:pPr>
-      <w:r>
-        <w:rPr>
-          <w:rFonts w:ascii="Times New Roman" w:hAnsi="Times New Roman" w:cs="Times New Roman"/>
-          <w:sz w:val="28"/>
-          <w:szCs w:val="28"/>
-          <w:i/>
-          <w:iCs/>
-        </w:rPr>
-        <w:t xml:space="preserve">???? = ????? * ???? ?? ??????? * ?????????? ?????? * ?????????? ????? * ?????????? ???? ??????? * ?????????? ??????????</w:t>
-      </w:r>
-    </w:p>
-    <w:p>
-      <w:pPr>
-        <w:ind w:firstLine="708"/>
-        <w:spacing w:after="120" w:line="360" w:lineRule="auto"/>
-      </w:pPr>
-      <w:r>
-        <w:rPr>
-          <w:rFonts w:ascii="Times New Roman" w:hAnsi="Times New Roman" w:cs="Times New Roman"/>
-          <w:sz w:val="28"/>
-          <w:szCs w:val="28"/>
-        </w:rPr>
-        <w:t xml:space="preserve">?? ??????? ???? ?????? ?????????? ????????? ???????????: ????????????, ??????-???????? ? ?????? ??????????.</w:t>
-      </w:r>
-    </w:p>
-    <w:p>
-      <w:pPr>
-        <w:spacing w:after="120" w:line="360" w:lineRule="auto"/>
-      </w:pPr>
-      <w:r>
-        <w:rPr>
-          <w:rFonts w:ascii="Times New Roman" w:hAnsi="Times New Roman" w:cs="Times New Roman"/>
-          <w:sz w:val="28"/>
-          <w:szCs w:val="28"/>
-          <w:b/>
-          <w:bCs/>
-        </w:rPr>
-        <w:t xml:space="preserve">????????? ?? ???????????</w:t>
-      </w:r>
-    </w:p>
-    <w:p>
-      <w:pPr>
-        <w:ind w:firstLine="708"/>
-        <w:spacing w:after="120" w:line="360" w:lineRule="auto"/>
-      </w:pPr>
-      <w:r>
-        <w:rPr>
-          <w:rFonts w:ascii="Times New Roman" w:hAnsi="Times New Roman" w:cs="Times New Roman"/>
-          <w:sz w:val="28"/>
-          <w:szCs w:val="28"/>
-        </w:rPr>
-        <w:t xml:space="preserve">GitHub: https://github.com/FunkyPotato7/renovacalc-java</w:t>
-      </w:r>
-    </w:p>
-    <w:p>
-      <w:pPr>
-        <w:spacing w:after="120" w:line="360" w:lineRule="auto"/>
-      </w:pPr>
-      <w:r>
-        <w:rPr>
-          <w:rFonts w:ascii="Times New Roman" w:hAnsi="Times New Roman" w:cs="Times New Roman"/>
-          <w:sz w:val="28"/>
-          <w:szCs w:val="28"/>
-          <w:b/>
-          <w:bCs/>
-        </w:rPr>
-        <w:t xml:space="preserve">????????</w:t>
-      </w:r>
-    </w:p>
-    <w:p>
-      <w:pPr>
-        <w:ind w:firstLine="708"/>
-        <w:spacing w:after="120" w:line="360" w:lineRule="auto"/>
-      </w:pPr>
-      <w:r>
-        <w:rPr>
-          <w:rFonts w:ascii="Times New Roman" w:hAnsi="Times New Roman" w:cs="Times New Roman"/>
-          <w:sz w:val="28"/>
-          <w:szCs w:val="28"/>
-        </w:rPr>
-        <w:t xml:space="preserve">? ?????????? ????????? ?????? ???? ???????? ?????????? Java Swing ?????????? ?? ?????????? ????????????. ???????? ?????????? ?????? ? ??????? ????????, ????????, ?????????, ?????????, ????, ????????? ?????? ? ?????????? ?????????? ???????????.</w:t>
-      </w:r>
-    </w:p>
-    <w:p>
-      <w:pPr>
-        <w:ind w:firstLine="708"/>
-        <w:spacing w:after="120" w:line="360" w:lineRule="auto"/>
-      </w:pPr>
-      <w:r>
-        <w:rPr>
-          <w:rFonts w:ascii="Times New Roman" w:hAnsi="Times New Roman" w:cs="Times New Roman"/>
-          <w:sz w:val="28"/>
-          <w:szCs w:val="28"/>
-        </w:rPr>
-        <w:t xml:space="preserve">?????? ????? ????????? ????????, ??????? ? JAR-???? ? ??????????? ? GitHub-??????????? ????? ?? ??????.</w:t>
-      </w:r>
-    </w:p>
-    <w:sectPr xmlns:w="http://schemas.openxmlformats.org/wordprocessingml/2006/main">
-      <w:pgSz w:w="11906" w:h="16838"/>
-      <w:pgMar w:top="1418" w:right="850" w:bottom="850" w:left="1417" w:header="708" w:footer="708" w:gutter="0"/>
-      <w:cols w:space="708"/>
-      <w:docGrid w:linePitch="360"/>
-    </w:sectPr>
+        <w:t xml:space="preserve">У результаті розроблено завершений навчальний Java Swing застосунок із практичним призначенням. Програма демонструє роботу з формами введення, списками, таблицями, вкладками, меню, діалогами файлів і динамічним оновленням результатів.</w:t>
+      </w:r>
+    </w:p>
+    <ns0:sectPr xmlns:ns0="http://schemas.openxmlformats.org/wordprocessingml/2006/main" ns0:rsidR="00447140" ns0:rsidRPr="00447140" ns0:rsidSect="007E75D1">
+      <ns0:pgSz ns0:w="11906" ns0:h="16838"/>
+      <ns0:pgMar ns0:top="1418" ns0:right="850" ns0:bottom="850" ns0:left="1417" ns0:header="708" ns0:footer="708" ns0:gutter="0"/>
+      <ns0:cols ns0:space="708"/>
+      <ns0:docGrid ns0:linePitch="360"/>
+    </ns0:sectPr>
   </w:body>
 </w:document>
 </file>

</xml_diff>